<commit_message>
AF starts at 50%, audio device choices persist, docs refreshed
- AF slider (and with it the tablet media volume) starts every session
  at 50% instead of whatever was saved last time
- RX output / mic input selections are written to settings the moment
  they change; Android sessions rarely end through the desktop save path
- README and the bundled manual describe the TX level meter, instant PTT
  feedback, mic permission/boost and the Bluetooth-mic limitation;
  help_ja.docx regenerated

Co-Authored-By: Claude Fable 5 <noreply@anthropic.com>
</commit_message>
<xml_diff>
--- a/docs/help_ja.docx
+++ b/docs/help_ja.docx
@@ -10,7 +10,7 @@
         <w:t xml:space="preserve">wfview for Android 操作説明書</w:t>
       </w:r>
     </w:p>
-    <w:bookmarkStart w:id="59" w:name="wfview-for-android-操作説明書"/>
+    <w:bookmarkStart w:id="60" w:name="wfview-for-android-操作説明書"/>
     <w:p>
       <w:pPr>
         <w:pStyle w:val="Heading1"/>
@@ -1569,7 +1569,10 @@
                 <w:bCs/>
                 <w:b/>
               </w:rPr>
-              <w:t xml:space="preserve">SWR メーター</w:t>
+              <w:t xml:space="preserve">Tx(dBfs) メーター</w:t>
+            </w:r>
+            <w:r>
+              <w:t xml:space="preserve">（送信音声レベル、送信中に赤いバーで振れます）</w:t>
             </w:r>
           </w:p>
         </w:tc>
@@ -2428,13 +2431,13 @@
     </w:p>
     <w:bookmarkEnd w:id="33"/>
     <w:bookmarkEnd w:id="34"/>
-    <w:bookmarkStart w:id="35" w:name="メーターs-swr"/>
+    <w:bookmarkStart w:id="35" w:name="メーターs-tx-レベル"/>
     <w:p>
       <w:pPr>
         <w:pStyle w:val="Heading2"/>
       </w:pPr>
       <w:r>
-        <w:t xml:space="preserve">6. メーター（S / SWR）</w:t>
+        <w:t xml:space="preserve">6. メーター（S / Tx レベル）</w:t>
       </w:r>
     </w:p>
     <w:p>
@@ -2647,7 +2650,7 @@
               <w:jc w:val="left"/>
             </w:pPr>
             <w:r>
-              <w:t xml:space="preserve">PTT です。タップで送信開始（表示が「</w:t>
+              <w:t xml:space="preserve">PTT です。タップした瞬間に「</w:t>
             </w:r>
             <w:r>
               <w:rPr>
@@ -2657,7 +2660,20 @@
               <w:t xml:space="preserve">送信中</w:t>
             </w:r>
             <w:r>
-              <w:t xml:space="preserve">」に変わります）、もう一度タップで受信へ戻ります</w:t>
+              <w:t xml:space="preserve">」表示に切り替わり送信開始、もう一度タップで受信へ戻ります。送信中は S メーター下の</w:t>
+            </w:r>
+            <w:r>
+              <w:t xml:space="preserve"> </w:t>
+            </w:r>
+            <w:r>
+              <w:rPr>
+                <w:bCs/>
+                <w:b/>
+              </w:rPr>
+              <w:t xml:space="preserve">Tx(dBfs) メーター</w:t>
+            </w:r>
+            <w:r>
+              <w:t xml:space="preserve">で自分の変調レベルを確認できます（-12〜-6 dBfs が目安）</w:t>
             </w:r>
           </w:p>
         </w:tc>
@@ -3718,6 +3734,24 @@
         <w:pStyle w:val="FirstParagraph"/>
       </w:pPr>
       <w:r>
+        <w:t xml:space="preserve">すべてのポップアップ画面（設定・バンド選択・Freq・レピータ／スプリット・メモリー・CW・TX/RX Proc）の</w:t>
+      </w:r>
+      <w:r>
+        <w:rPr>
+          <w:bCs/>
+          <w:b/>
+        </w:rPr>
+        <w:t xml:space="preserve">左上に共通の「← 戻る」ボタン</w:t>
+      </w:r>
+      <w:r>
+        <w:t xml:space="preserve">があり、タップするとメイン画面へ戻ります。TX Proc のように縦に長い画面は、指で上下にスクロールできます。</w:t>
+      </w:r>
+    </w:p>
+    <w:p>
+      <w:pPr>
+        <w:pStyle w:val="BodyText"/>
+      </w:pPr>
+      <w:r>
         <w:t xml:space="preserve">Settings・Status・Log・Bands・Freq・TX Proc・RX Proc・</w:t>
       </w:r>
       <w:r>
@@ -6119,7 +6153,7 @@
       </w:r>
     </w:p>
     <w:bookmarkEnd w:id="56"/>
-    <w:bookmarkStart w:id="58" w:name="注意事項"/>
+    <w:bookmarkStart w:id="59" w:name="注意事項"/>
     <w:p>
       <w:pPr>
         <w:pStyle w:val="Heading2"/>
@@ -6128,13 +6162,98 @@
         <w:t xml:space="preserve">17. 注意事項</w:t>
       </w:r>
     </w:p>
+    <w:bookmarkStart w:id="58" w:name="マイク入力について"/>
+    <w:p>
+      <w:pPr>
+        <w:pStyle w:val="Heading3"/>
+      </w:pPr>
+      <w:r>
+        <w:t xml:space="preserve">マイク入力について</w:t>
+      </w:r>
+    </w:p>
     <w:p>
       <w:pPr>
         <w:numPr>
           <w:ilvl w:val="0"/>
           <w:numId w:val="1034"/>
         </w:numPr>
-        <w:pStyle w:val="Compact"/>
+      </w:pPr>
+      <w:r>
+        <w:t xml:space="preserve">送信の変調には</w:t>
+      </w:r>
+      <w:r>
+        <w:rPr>
+          <w:bCs/>
+          <w:b/>
+        </w:rPr>
+        <w:t xml:space="preserve">マイク権限</w:t>
+      </w:r>
+      <w:r>
+        <w:t xml:space="preserve">が必要です。初回起動時のダイアログで「許可」を選んでください（拒否した場合は Android の設定 → アプリ → wfview → 権限 から変更できます）。</w:t>
+      </w:r>
+    </w:p>
+    <w:p>
+      <w:pPr>
+        <w:numPr>
+          <w:ilvl w:val="0"/>
+          <w:numId w:val="1034"/>
+        </w:numPr>
+      </w:pPr>
+      <w:r>
+        <w:rPr>
+          <w:bCs/>
+          <w:b/>
+        </w:rPr>
+        <w:t xml:space="preserve">マイク入力は「Built in microphone（内蔵マイク）」を推奨</w:t>
+      </w:r>
+      <w:r>
+        <w:t xml:space="preserve">します。Bluetooth イヤホンのマイクは Android の録音経路（SCO）に未対応のため、現状は音声が取れません（受信音の Bluetooth 再生は問題ありません）。</w:t>
+      </w:r>
+    </w:p>
+    <w:p>
+      <w:pPr>
+        <w:numPr>
+          <w:ilvl w:val="0"/>
+          <w:numId w:val="1034"/>
+        </w:numPr>
+      </w:pPr>
+      <w:r>
+        <w:t xml:space="preserve">内蔵マイクの生レベルが低いため、アプリ内で約 6 倍のブーストをかけています。Tx(dBfs) メーターを見ながら、必要に応じて</w:t>
+      </w:r>
+      <w:r>
+        <w:t xml:space="preserve"> </w:t>
+      </w:r>
+      <w:r>
+        <w:rPr>
+          <w:bCs/>
+          <w:b/>
+        </w:rPr>
+        <w:t xml:space="preserve">MOD</w:t>
+      </w:r>
+      <w:r>
+        <w:t xml:space="preserve"> </w:t>
+      </w:r>
+      <w:r>
+        <w:t xml:space="preserve">スライダーで調整してください。</w:t>
+      </w:r>
+    </w:p>
+    <w:p>
+      <w:pPr>
+        <w:numPr>
+          <w:ilvl w:val="0"/>
+          <w:numId w:val="1034"/>
+        </w:numPr>
+      </w:pPr>
+      <w:r>
+        <w:t xml:space="preserve">「受信音出力」「マイク入力」の選択は変更した時点で保存され、次回起動時も維持されます。</w:t>
+      </w:r>
+    </w:p>
+    <w:p>
+      <w:pPr>
+        <w:numPr>
+          <w:ilvl w:val="0"/>
+          <w:numId w:val="1034"/>
+        </w:numPr>
       </w:pPr>
       <w:r>
         <w:t xml:space="preserve">送信を伴う操作（送信・TUNE・CW 送出）は、周波数・電力・アンテナ・免許範囲を確認のうえ自己責任で行ってください。電波の発射は各国の電波法令の範囲内で行ってください。</w:t>
@@ -6146,7 +6265,6 @@
           <w:ilvl w:val="0"/>
           <w:numId w:val="1034"/>
         </w:numPr>
-        <w:pStyle w:val="Compact"/>
       </w:pPr>
       <w:r>
         <w:t xml:space="preserve">メモリー編集は実験的機能です。必ずリグのバックアップを取ってから操作してください。</w:t>
@@ -6158,7 +6276,6 @@
           <w:ilvl w:val="0"/>
           <w:numId w:val="1034"/>
         </w:numPr>
-        <w:pStyle w:val="Compact"/>
       </w:pPr>
       <w:r>
         <w:t xml:space="preserve">本アプリはシリアル／USB 接続に非対応です。</w:t>
@@ -6180,7 +6297,6 @@
           <w:ilvl w:val="0"/>
           <w:numId w:val="1034"/>
         </w:numPr>
-        <w:pStyle w:val="Compact"/>
       </w:pPr>
       <w:r>
         <w:t xml:space="preserve">本アプリはデスクトップ版 wfview（GPLv3）を Android タブレット向けに再構成したものです。細部の挙動は本家 wfview に準じます。本家の情報は</w:t>
@@ -6205,6 +6321,7 @@
     </w:p>
     <w:bookmarkEnd w:id="58"/>
     <w:bookmarkEnd w:id="59"/>
+    <w:bookmarkEnd w:id="60"/>
     <w:sectPr/>
   </w:body>
 </w:document>

</xml_diff>

<commit_message>
Docs: AF slider starts at 50%
Co-Authored-By: Claude Fable 5 <noreply@anthropic.com>
</commit_message>
<xml_diff>
--- a/docs/help_ja.docx
+++ b/docs/help_ja.docx
@@ -3484,7 +3484,20 @@
               <w:t xml:space="preserve">Android のメディア音量と連動</w:t>
             </w:r>
             <w:r>
-              <w:t xml:space="preserve">します（AF 最大＝端末音量最大）</w:t>
+              <w:t xml:space="preserve">します（AF 最大＝端末音量最大）。</w:t>
+            </w:r>
+            <w:r>
+              <w:rPr>
+                <w:bCs/>
+                <w:b/>
+              </w:rPr>
+              <w:t xml:space="preserve">起動時は常に 50%</w:t>
+            </w:r>
+            <w:r>
+              <w:t xml:space="preserve"> </w:t>
+            </w:r>
+            <w:r>
+              <w:t xml:space="preserve">から始まります</w:t>
             </w:r>
           </w:p>
         </w:tc>

</xml_diff>

<commit_message>
Docs + UX: log/status popups get back navigation, Freq keypad Back key
- Log window and radio status (selectRadio) now open through
  showAndRaiseWidget: fit-to-screen wrapper with the shared back button.
  Status also returns to the main screen on cancel or radio selection
  (androidClosePopup, shared helper for the proxy window() trap; band
  select and help refactored onto it).
- Freq keypad: the digit-delete key reads "Back" again in Japanese so it
  is not confused with the screen-level 戻る button.
- README, docs/help_ja.md (+ regenerated docx, bundled qrc help):
  responsive layout, popup back-button coverage, auto-close behaviour.

Co-Authored-By: Claude Fable 5 <noreply@anthropic.com>
</commit_message>
<xml_diff>
--- a/docs/help_ja.docx
+++ b/docs/help_ja.docx
@@ -78,7 +78,17 @@
         <w:t xml:space="preserve">対象端末</w:t>
       </w:r>
       <w:r>
-        <w:t xml:space="preserve">: Android タブレット（arm64-v8a）</w:t>
+        <w:t xml:space="preserve">: Android タブレット／スマートフォン（arm64-v8a）。画面サイズ・解像度・縦横比には</w:t>
+      </w:r>
+      <w:r>
+        <w:rPr>
+          <w:bCs/>
+          <w:b/>
+        </w:rPr>
+        <w:t xml:space="preserve">自動で追従</w:t>
+      </w:r>
+      <w:r>
+        <w:t xml:space="preserve">します（レスポンシブ表示）</w:t>
       </w:r>
     </w:p>
     <w:p>
@@ -1989,7 +1999,23 @@
         <w:t xml:space="preserve">Freq</w:t>
       </w:r>
       <w:r>
-        <w:t xml:space="preserve">: テンキー画面で周波数を数字入力します。目的の周波数が分かっているときに最速です。</w:t>
+        <w:t xml:space="preserve">: テンキー画面で周波数を数字入力します。目的の周波数が分かっているときに最速です。テンキーの</w:t>
+      </w:r>
+      <w:r>
+        <w:t xml:space="preserve"> </w:t>
+      </w:r>
+      <w:r>
+        <w:rPr>
+          <w:bCs/>
+          <w:b/>
+        </w:rPr>
+        <w:t xml:space="preserve">Back</w:t>
+      </w:r>
+      <w:r>
+        <w:t xml:space="preserve"> </w:t>
+      </w:r>
+      <w:r>
+        <w:t xml:space="preserve">キーは入力を 1 桁削除します（メイン画面へ戻るのは左上の「← 戻る」）。</w:t>
       </w:r>
     </w:p>
     <w:p>
@@ -2008,7 +2034,7 @@
         <w:t xml:space="preserve">Bands</w:t>
       </w:r>
       <w:r>
-        <w:t xml:space="preserve">: バンドボタン（3.5 / 7 / 14 / 21 / 28 / 50 MHz…）でバンドを一気に移動します。</w:t>
+        <w:t xml:space="preserve">: バンドボタン（3.5 / 7 / 14 / 21 / 28 / 50 MHz…）でバンドを一気に移動します。バンドをタップすると画面は自動的に閉じてメイン画面へ戻ります。</w:t>
       </w:r>
     </w:p>
     <w:bookmarkEnd w:id="29"/>
@@ -3747,7 +3773,27 @@
         <w:pStyle w:val="FirstParagraph"/>
       </w:pPr>
       <w:r>
-        <w:t xml:space="preserve">すべてのポップアップ画面（設定・バンド選択・Freq・レピータ／スプリット・メモリー・CW・TX/RX Proc）の</w:t>
+        <w:t xml:space="preserve">すべてのポップアップ画面（設定・バンド選択・Freq・</w:t>
+      </w:r>
+      <w:r>
+        <w:rPr>
+          <w:bCs/>
+          <w:b/>
+        </w:rPr>
+        <w:t xml:space="preserve">ログ表示</w:t>
+      </w:r>
+      <w:r>
+        <w:t xml:space="preserve">・</w:t>
+      </w:r>
+      <w:r>
+        <w:rPr>
+          <w:bCs/>
+          <w:b/>
+        </w:rPr>
+        <w:t xml:space="preserve">Status（無線機ステータス）</w:t>
+      </w:r>
+      <w:r>
+        <w:t xml:space="preserve">・レピータ／スプリット・メモリー・CW・TX/RX Proc）の</w:t>
       </w:r>
       <w:r>
         <w:rPr>
@@ -3839,6 +3885,28 @@
       </w:pPr>
       <w:r>
         <w:t xml:space="preserve">ヘルプ画面だけは 2 段階で、章へジャンプした後は「← 目次に戻る」→「← 戻る」の順で戻ります。</w:t>
+      </w:r>
+    </w:p>
+    <w:p>
+      <w:pPr>
+        <w:numPr>
+          <w:ilvl w:val="0"/>
+          <w:numId w:val="1025"/>
+        </w:numPr>
+        <w:pStyle w:val="Compact"/>
+      </w:pPr>
+      <w:r>
+        <w:t xml:space="preserve">バンド選択はバンドを、Status は無線機を選ぶと</w:t>
+      </w:r>
+      <w:r>
+        <w:rPr>
+          <w:bCs/>
+          <w:b/>
+        </w:rPr>
+        <w:t xml:space="preserve">自動的に閉じて</w:t>
+      </w:r>
+      <w:r>
+        <w:t xml:space="preserve">メイン画面へ戻ります（Status はキャンセルでも戻ります）。</w:t>
       </w:r>
     </w:p>
     <w:p>

</xml_diff>

<commit_message>
Rename to wfview4android; fix help swipe scrolling
Rename (unofficial fork branding):
- TARGET / bundle prefix / Android package: org.wfview.wfview ->
  org.wfview4android (new app identity; coexists with the old install)
- Application/organization/display names and window title
- README and manual retitled; marked explicitly as an unofficial fork
  independent of the upstream wfview project (docx regenerated)
- Build notes updated for the new package name

Help viewer: swipe scrolling never engaged because QScroller grabbed the
touch gesture, but a proxy-embedded viewport only receives the mouse
events the wrapping QGraphicsView synthesises -- grab the left-mouse
gesture instead (TOC link taps are press-resolved and unaffected).
Verified on device.

Co-Authored-By: Claude Fable 5 <noreply@anthropic.com>
</commit_message>
<xml_diff>
--- a/docs/help_ja.docx
+++ b/docs/help_ja.docx
@@ -7,16 +7,16 @@
         <w:pStyle w:val="Title"/>
       </w:pPr>
       <w:r>
-        <w:t xml:space="preserve">wfview for Android 操作説明書</w:t>
-      </w:r>
-    </w:p>
-    <w:bookmarkStart w:id="60" w:name="wfview-for-android-操作説明書"/>
+        <w:t xml:space="preserve">wfview4android 操作説明書</w:t>
+      </w:r>
+    </w:p>
+    <w:bookmarkStart w:id="60" w:name="wfview4android-操作説明書"/>
     <w:p>
       <w:pPr>
         <w:pStyle w:val="Heading1"/>
       </w:pPr>
       <w:r>
-        <w:t xml:space="preserve">wfview for Android 操作説明書</w:t>
+        <w:t xml:space="preserve">wfview4android 操作説明書</w:t>
       </w:r>
     </w:p>
     <w:p>
@@ -24,17 +24,17 @@
         <w:pStyle w:val="FirstParagraph"/>
       </w:pPr>
       <w:r>
-        <w:t xml:space="preserve">Android タブレット向けにタッチ操作へ最適化した</w:t>
-      </w:r>
-      <w:r>
-        <w:t xml:space="preserve"> </w:t>
-      </w:r>
-      <w:r>
-        <w:rPr>
-          <w:bCs/>
-          <w:b/>
-        </w:rPr>
-        <w:t xml:space="preserve">wfview</w:t>
+        <w:t xml:space="preserve">Android 向けにタッチ操作へ最適化した wfview の非公式移植版</w:t>
+      </w:r>
+      <w:r>
+        <w:t xml:space="preserve"> </w:t>
+      </w:r>
+      <w:r>
+        <w:rPr>
+          <w:bCs/>
+          <w:b/>
+        </w:rPr>
+        <w:t xml:space="preserve">wfview4android</w:t>
       </w:r>
       <w:r>
         <w:t xml:space="preserve">（ネットワーク接続専用）の操作説明書です。</w:t>

</xml_diff>

<commit_message>
New app icon; installation instructions in README and manual
- Launcher icon (all mipmap densities) and in-app window icon: spectrum
  trace with glow, waterfall band, tuning dial and a "4A" tag on the
  app's dark theme. Generated at 2048px, exported per density.
- README and help_ja.md (+docx, bundled qrc help): end-user install
  steps for the release APK (sideload permission, mic permission,
  first connection), signature-mismatch note, Android 9+/arm64-v8a.

Co-Authored-By: Claude Fable 5 <noreply@anthropic.com>
</commit_message>
<xml_diff>
--- a/docs/help_ja.docx
+++ b/docs/help_ja.docx
@@ -812,6 +812,26 @@
     </w:p>
     <w:p>
       <w:pPr>
+        <w:pStyle w:val="FirstParagraph"/>
+      </w:pPr>
+      <w:r>
+        <w:t xml:space="preserve">本アプリは Google Play では配布していません。リリース APK（</w:t>
+      </w:r>
+      <w:r>
+        <w:rPr>
+          <w:rStyle w:val="VerbatimChar"/>
+        </w:rPr>
+        <w:t xml:space="preserve">wfview4android-release.apk</w:t>
+      </w:r>
+      <w:r>
+        <w:t xml:space="preserve"> </w:t>
+      </w:r>
+      <w:r>
+        <w:t xml:space="preserve">等）を直接インストールします。</w:t>
+      </w:r>
+    </w:p>
+    <w:p>
+      <w:pPr>
         <w:numPr>
           <w:ilvl w:val="0"/>
           <w:numId w:val="1010"/>
@@ -819,32 +839,94 @@
         <w:pStyle w:val="Compact"/>
       </w:pPr>
       <w:r>
-        <w:t xml:space="preserve">本アプリはストア非配布のため、APK（</w:t>
+        <w:rPr>
+          <w:bCs/>
+          <w:b/>
+        </w:rPr>
+        <w:t xml:space="preserve">動作条件</w:t>
+      </w:r>
+      <w:r>
+        <w:t xml:space="preserve">: Android 9 以降（arm64-v8a）。横向き表示のためタブレット推奨（スマートフォンでも動作します）。</w:t>
+      </w:r>
+    </w:p>
+    <w:p>
+      <w:pPr>
+        <w:numPr>
+          <w:ilvl w:val="0"/>
+          <w:numId w:val="1010"/>
+        </w:numPr>
+        <w:pStyle w:val="Compact"/>
+      </w:pPr>
+      <w:r>
+        <w:t xml:space="preserve">APK ファイルを端末へコピーし（ダウンロード／USB／クラウドなど）、ファイルマネージャでタップします。</w:t>
+      </w:r>
+    </w:p>
+    <w:p>
+      <w:pPr>
+        <w:numPr>
+          <w:ilvl w:val="0"/>
+          <w:numId w:val="1010"/>
+        </w:numPr>
+        <w:pStyle w:val="Compact"/>
+      </w:pPr>
+      <w:r>
+        <w:t xml:space="preserve">「提供元不明のアプリのインストール」の確認が出たら、使用中のアプリ（ファイルマネージャ等）に</w:t>
+      </w:r>
+      <w:r>
+        <w:rPr>
+          <w:bCs/>
+          <w:b/>
+        </w:rPr>
+        <w:t xml:space="preserve">許可</w:t>
+      </w:r>
+      <w:r>
+        <w:t xml:space="preserve">を与えます。</w:t>
+      </w:r>
+    </w:p>
+    <w:p>
+      <w:pPr>
+        <w:numPr>
+          <w:ilvl w:val="0"/>
+          <w:numId w:val="1010"/>
+        </w:numPr>
+        <w:pStyle w:val="Compact"/>
+      </w:pPr>
+      <w:r>
+        <w:t xml:space="preserve">初回起動時に</w:t>
+      </w:r>
+      <w:r>
+        <w:rPr>
+          <w:bCs/>
+          <w:b/>
+        </w:rPr>
+        <w:t xml:space="preserve">マイクへのアクセス許可</w:t>
+      </w:r>
+      <w:r>
+        <w:t xml:space="preserve">を求められるので「アプリの使用時のみ」を選びます（送信音声に必要。拒否すると変調がかかりません）。</w:t>
+      </w:r>
+    </w:p>
+    <w:p>
+      <w:pPr>
+        <w:numPr>
+          <w:ilvl w:val="0"/>
+          <w:numId w:val="1010"/>
+        </w:numPr>
+        <w:pStyle w:val="Compact"/>
+      </w:pPr>
+      <w:r>
+        <w:t xml:space="preserve">開発者向けの代替手段:</w:t>
+      </w:r>
+      <w:r>
+        <w:t xml:space="preserve"> </w:t>
       </w:r>
       <w:r>
         <w:rPr>
           <w:rStyle w:val="VerbatimChar"/>
         </w:rPr>
-        <w:t xml:space="preserve">android-build-debug.apk</w:t>
-      </w:r>
-      <w:r>
-        <w:t xml:space="preserve">）を</w:t>
-      </w:r>
-      <w:r>
-        <w:t xml:space="preserve"> </w:t>
-      </w:r>
-      <w:r>
-        <w:rPr>
-          <w:bCs/>
-          <w:b/>
-        </w:rPr>
-        <w:t xml:space="preserve">adb install</w:t>
-      </w:r>
-      <w:r>
-        <w:t xml:space="preserve"> </w:t>
-      </w:r>
-      <w:r>
-        <w:t xml:space="preserve">などでインストールします（手順は</w:t>
+        <w:t xml:space="preserve">adb install -r wfview4android-release.apk</w:t>
+      </w:r>
+      <w:r>
+        <w:t xml:space="preserve">（ビルド手順は</w:t>
       </w:r>
       <w:r>
         <w:t xml:space="preserve"> </w:t>
@@ -866,7 +948,19 @@
       <w:pPr>
         <w:numPr>
           <w:ilvl w:val="0"/>
-          <w:numId w:val="1010"/>
+          <w:numId w:val="1011"/>
+        </w:numPr>
+        <w:pStyle w:val="Compact"/>
+      </w:pPr>
+      <w:r>
+        <w:t xml:space="preserve">署名の異なる APK（デバッグ版など）とは上書きインストールできません。入れ替える場合は一度アンインストールしてください（接続プロファイル等の設定は消えます）。</w:t>
+      </w:r>
+    </w:p>
+    <w:p>
+      <w:pPr>
+        <w:numPr>
+          <w:ilvl w:val="0"/>
+          <w:numId w:val="1011"/>
         </w:numPr>
         <w:pStyle w:val="Compact"/>
       </w:pPr>
@@ -888,7 +982,7 @@
       <w:pPr>
         <w:numPr>
           <w:ilvl w:val="0"/>
-          <w:numId w:val="1010"/>
+          <w:numId w:val="1011"/>
         </w:numPr>
         <w:pStyle w:val="Compact"/>
       </w:pPr>
@@ -926,7 +1020,7 @@
       <w:pPr>
         <w:numPr>
           <w:ilvl w:val="0"/>
-          <w:numId w:val="1011"/>
+          <w:numId w:val="1012"/>
         </w:numPr>
         <w:pStyle w:val="Compact"/>
       </w:pPr>
@@ -954,7 +1048,7 @@
       <w:pPr>
         <w:numPr>
           <w:ilvl w:val="0"/>
-          <w:numId w:val="1011"/>
+          <w:numId w:val="1012"/>
         </w:numPr>
         <w:pStyle w:val="Compact"/>
       </w:pPr>
@@ -982,126 +1076,126 @@
       <w:pPr>
         <w:numPr>
           <w:ilvl w:val="1"/>
+          <w:numId w:val="1013"/>
+        </w:numPr>
+        <w:pStyle w:val="Compact"/>
+      </w:pPr>
+      <w:r>
+        <w:rPr>
+          <w:bCs/>
+          <w:b/>
+        </w:rPr>
+        <w:t xml:space="preserve">Network（Enable LAN）</w:t>
+      </w:r>
+      <w:r>
+        <w:t xml:space="preserve">: ネットワーク接続を有効にします（iPad 版は常にこちらを使います）。</w:t>
+      </w:r>
+    </w:p>
+    <w:p>
+      <w:pPr>
+        <w:numPr>
+          <w:ilvl w:val="1"/>
+          <w:numId w:val="1013"/>
+        </w:numPr>
+        <w:pStyle w:val="Compact"/>
+      </w:pPr>
+      <w:r>
+        <w:rPr>
+          <w:bCs/>
+          <w:b/>
+        </w:rPr>
+        <w:t xml:space="preserve">Hostname</w:t>
+      </w:r>
+      <w:r>
+        <w:t xml:space="preserve">: リグ本体または wfserver の IP アドレス／ホスト名（例:</w:t>
+      </w:r>
+      <w:r>
+        <w:t xml:space="preserve"> </w:t>
+      </w:r>
+      <w:r>
+        <w:rPr>
+          <w:rStyle w:val="VerbatimChar"/>
+        </w:rPr>
+        <w:t xml:space="preserve">192.168.1.20</w:t>
+      </w:r>
+      <w:r>
+        <w:t xml:space="preserve">）</w:t>
+      </w:r>
+    </w:p>
+    <w:p>
+      <w:pPr>
+        <w:numPr>
+          <w:ilvl w:val="1"/>
+          <w:numId w:val="1013"/>
+        </w:numPr>
+        <w:pStyle w:val="Compact"/>
+      </w:pPr>
+      <w:r>
+        <w:rPr>
+          <w:bCs/>
+          <w:b/>
+        </w:rPr>
+        <w:t xml:space="preserve">Control Port</w:t>
+      </w:r>
+      <w:r>
+        <w:t xml:space="preserve">: 制御用ポート番号（既定</w:t>
+      </w:r>
+      <w:r>
+        <w:t xml:space="preserve"> </w:t>
+      </w:r>
+      <w:r>
+        <w:rPr>
+          <w:rStyle w:val="VerbatimChar"/>
+        </w:rPr>
+        <w:t xml:space="preserve">50001</w:t>
+      </w:r>
+      <w:r>
+        <w:t xml:space="preserve">）</w:t>
+      </w:r>
+    </w:p>
+    <w:p>
+      <w:pPr>
+        <w:numPr>
+          <w:ilvl w:val="1"/>
+          <w:numId w:val="1013"/>
+        </w:numPr>
+        <w:pStyle w:val="Compact"/>
+      </w:pPr>
+      <w:r>
+        <w:rPr>
+          <w:bCs/>
+          <w:b/>
+        </w:rPr>
+        <w:t xml:space="preserve">Username / Password</w:t>
+      </w:r>
+      <w:r>
+        <w:t xml:space="preserve">: wfserver（またはリグ本体の Network 設定）で決めた認証情報</w:t>
+      </w:r>
+    </w:p>
+    <w:p>
+      <w:pPr>
+        <w:numPr>
+          <w:ilvl w:val="1"/>
+          <w:numId w:val="1013"/>
+        </w:numPr>
+        <w:pStyle w:val="Compact"/>
+      </w:pPr>
+      <w:r>
+        <w:rPr>
+          <w:bCs/>
+          <w:b/>
+        </w:rPr>
+        <w:t xml:space="preserve">RX / TX Audio</w:t>
+      </w:r>
+      <w:r>
+        <w:t xml:space="preserve">: 受信・送信音声のコーデックとサンプルレート。通常は既定のままで動作します。音が途切れる回線では低いレートやより圧縮率の高いコーデック（Opus など）を試してください。</w:t>
+      </w:r>
+    </w:p>
+    <w:p>
+      <w:pPr>
+        <w:numPr>
+          <w:ilvl w:val="0"/>
           <w:numId w:val="1012"/>
-        </w:numPr>
-        <w:pStyle w:val="Compact"/>
-      </w:pPr>
-      <w:r>
-        <w:rPr>
-          <w:bCs/>
-          <w:b/>
-        </w:rPr>
-        <w:t xml:space="preserve">Network（Enable LAN）</w:t>
-      </w:r>
-      <w:r>
-        <w:t xml:space="preserve">: ネットワーク接続を有効にします（iPad 版は常にこちらを使います）。</w:t>
-      </w:r>
-    </w:p>
-    <w:p>
-      <w:pPr>
-        <w:numPr>
-          <w:ilvl w:val="1"/>
-          <w:numId w:val="1012"/>
-        </w:numPr>
-        <w:pStyle w:val="Compact"/>
-      </w:pPr>
-      <w:r>
-        <w:rPr>
-          <w:bCs/>
-          <w:b/>
-        </w:rPr>
-        <w:t xml:space="preserve">Hostname</w:t>
-      </w:r>
-      <w:r>
-        <w:t xml:space="preserve">: リグ本体または wfserver の IP アドレス／ホスト名（例:</w:t>
-      </w:r>
-      <w:r>
-        <w:t xml:space="preserve"> </w:t>
-      </w:r>
-      <w:r>
-        <w:rPr>
-          <w:rStyle w:val="VerbatimChar"/>
-        </w:rPr>
-        <w:t xml:space="preserve">192.168.1.20</w:t>
-      </w:r>
-      <w:r>
-        <w:t xml:space="preserve">）</w:t>
-      </w:r>
-    </w:p>
-    <w:p>
-      <w:pPr>
-        <w:numPr>
-          <w:ilvl w:val="1"/>
-          <w:numId w:val="1012"/>
-        </w:numPr>
-        <w:pStyle w:val="Compact"/>
-      </w:pPr>
-      <w:r>
-        <w:rPr>
-          <w:bCs/>
-          <w:b/>
-        </w:rPr>
-        <w:t xml:space="preserve">Control Port</w:t>
-      </w:r>
-      <w:r>
-        <w:t xml:space="preserve">: 制御用ポート番号（既定</w:t>
-      </w:r>
-      <w:r>
-        <w:t xml:space="preserve"> </w:t>
-      </w:r>
-      <w:r>
-        <w:rPr>
-          <w:rStyle w:val="VerbatimChar"/>
-        </w:rPr>
-        <w:t xml:space="preserve">50001</w:t>
-      </w:r>
-      <w:r>
-        <w:t xml:space="preserve">）</w:t>
-      </w:r>
-    </w:p>
-    <w:p>
-      <w:pPr>
-        <w:numPr>
-          <w:ilvl w:val="1"/>
-          <w:numId w:val="1012"/>
-        </w:numPr>
-        <w:pStyle w:val="Compact"/>
-      </w:pPr>
-      <w:r>
-        <w:rPr>
-          <w:bCs/>
-          <w:b/>
-        </w:rPr>
-        <w:t xml:space="preserve">Username / Password</w:t>
-      </w:r>
-      <w:r>
-        <w:t xml:space="preserve">: wfserver（またはリグ本体の Network 設定）で決めた認証情報</w:t>
-      </w:r>
-    </w:p>
-    <w:p>
-      <w:pPr>
-        <w:numPr>
-          <w:ilvl w:val="1"/>
-          <w:numId w:val="1012"/>
-        </w:numPr>
-        <w:pStyle w:val="Compact"/>
-      </w:pPr>
-      <w:r>
-        <w:rPr>
-          <w:bCs/>
-          <w:b/>
-        </w:rPr>
-        <w:t xml:space="preserve">RX / TX Audio</w:t>
-      </w:r>
-      <w:r>
-        <w:t xml:space="preserve">: 受信・送信音声のコーデックとサンプルレート。通常は既定のままで動作します。音が途切れる回線では低いレートやより圧縮率の高いコーデック（Opus など）を試してください。</w:t>
-      </w:r>
-    </w:p>
-    <w:p>
-      <w:pPr>
-        <w:numPr>
-          <w:ilvl w:val="0"/>
-          <w:numId w:val="1011"/>
         </w:numPr>
         <w:pStyle w:val="Compact"/>
       </w:pPr>
@@ -1207,7 +1301,7 @@
       <w:pPr>
         <w:numPr>
           <w:ilvl w:val="0"/>
-          <w:numId w:val="1013"/>
+          <w:numId w:val="1014"/>
         </w:numPr>
         <w:pStyle w:val="Compact"/>
       </w:pPr>
@@ -1272,7 +1366,7 @@
       <w:pPr>
         <w:numPr>
           <w:ilvl w:val="0"/>
-          <w:numId w:val="1013"/>
+          <w:numId w:val="1014"/>
         </w:numPr>
         <w:pStyle w:val="Compact"/>
       </w:pPr>
@@ -1284,7 +1378,7 @@
       <w:pPr>
         <w:numPr>
           <w:ilvl w:val="0"/>
-          <w:numId w:val="1013"/>
+          <w:numId w:val="1014"/>
         </w:numPr>
         <w:pStyle w:val="Compact"/>
       </w:pPr>
@@ -1306,7 +1400,7 @@
       <w:pPr>
         <w:numPr>
           <w:ilvl w:val="0"/>
-          <w:numId w:val="1013"/>
+          <w:numId w:val="1014"/>
         </w:numPr>
         <w:pStyle w:val="Compact"/>
       </w:pPr>
@@ -1338,7 +1432,7 @@
       <w:pPr>
         <w:numPr>
           <w:ilvl w:val="0"/>
-          <w:numId w:val="1014"/>
+          <w:numId w:val="1015"/>
         </w:numPr>
         <w:pStyle w:val="Compact"/>
       </w:pPr>
@@ -1373,7 +1467,7 @@
       <w:pPr>
         <w:numPr>
           <w:ilvl w:val="0"/>
-          <w:numId w:val="1014"/>
+          <w:numId w:val="1015"/>
         </w:numPr>
         <w:pStyle w:val="Compact"/>
       </w:pPr>
@@ -1401,7 +1495,7 @@
       <w:pPr>
         <w:numPr>
           <w:ilvl w:val="0"/>
-          <w:numId w:val="1014"/>
+          <w:numId w:val="1015"/>
         </w:numPr>
         <w:pStyle w:val="Compact"/>
       </w:pPr>
@@ -1730,7 +1824,7 @@
       <w:pPr>
         <w:numPr>
           <w:ilvl w:val="0"/>
-          <w:numId w:val="1015"/>
+          <w:numId w:val="1016"/>
         </w:numPr>
         <w:pStyle w:val="Compact"/>
       </w:pPr>
@@ -1742,7 +1836,7 @@
       <w:pPr>
         <w:numPr>
           <w:ilvl w:val="0"/>
-          <w:numId w:val="1015"/>
+          <w:numId w:val="1016"/>
         </w:numPr>
         <w:pStyle w:val="Compact"/>
       </w:pPr>
@@ -1826,7 +1920,7 @@
       <w:pPr>
         <w:numPr>
           <w:ilvl w:val="0"/>
-          <w:numId w:val="1016"/>
+          <w:numId w:val="1017"/>
         </w:numPr>
         <w:pStyle w:val="Compact"/>
       </w:pPr>
@@ -1858,7 +1952,7 @@
       <w:pPr>
         <w:numPr>
           <w:ilvl w:val="0"/>
-          <w:numId w:val="1016"/>
+          <w:numId w:val="1017"/>
         </w:numPr>
         <w:pStyle w:val="Compact"/>
       </w:pPr>
@@ -1877,66 +1971,66 @@
       <w:pPr>
         <w:numPr>
           <w:ilvl w:val="1"/>
+          <w:numId w:val="1018"/>
+        </w:numPr>
+        <w:pStyle w:val="Compact"/>
+      </w:pPr>
+      <w:r>
+        <w:t xml:space="preserve">例: 1 kHz の桁をタップ → ダイアル 1 ステップ＝1 kHz</w:t>
+      </w:r>
+    </w:p>
+    <w:p>
+      <w:pPr>
+        <w:numPr>
+          <w:ilvl w:val="1"/>
+          <w:numId w:val="1018"/>
+        </w:numPr>
+        <w:pStyle w:val="Compact"/>
+      </w:pPr>
+      <w:r>
+        <w:t xml:space="preserve">SSB の同調は 100 Hz〜1 kHz、CW は 10〜100 Hz の桁が使いやすい目安です。</w:t>
+      </w:r>
+    </w:p>
+    <w:p>
+      <w:pPr>
+        <w:numPr>
+          <w:ilvl w:val="0"/>
           <w:numId w:val="1017"/>
         </w:numPr>
         <w:pStyle w:val="Compact"/>
       </w:pPr>
       <w:r>
-        <w:t xml:space="preserve">例: 1 kHz の桁をタップ → ダイアル 1 ステップ＝1 kHz</w:t>
-      </w:r>
-    </w:p>
-    <w:p>
-      <w:pPr>
-        <w:numPr>
-          <w:ilvl w:val="1"/>
+        <w:t xml:space="preserve">周波数表示の右の</w:t>
+      </w:r>
+      <w:r>
+        <w:t xml:space="preserve"> </w:t>
+      </w:r>
+      <w:r>
+        <w:rPr>
+          <w:bCs/>
+          <w:b/>
+        </w:rPr>
+        <w:t xml:space="preserve">▼／▲ ボタン</w:t>
+      </w:r>
+      <w:r>
+        <w:t xml:space="preserve">でも、選んだステップで 1 ステップずつ下げ／上げできます（</w:t>
+      </w:r>
+      <w:r>
+        <w:rPr>
+          <w:bCs/>
+          <w:b/>
+        </w:rPr>
+        <w:t xml:space="preserve">長押しで連続</w:t>
+      </w:r>
+      <w:r>
+        <w:t xml:space="preserve">）。</w:t>
+      </w:r>
+    </w:p>
+    <w:p>
+      <w:pPr>
+        <w:numPr>
+          <w:ilvl w:val="0"/>
           <w:numId w:val="1017"/>
-        </w:numPr>
-        <w:pStyle w:val="Compact"/>
-      </w:pPr>
-      <w:r>
-        <w:t xml:space="preserve">SSB の同調は 100 Hz〜1 kHz、CW は 10〜100 Hz の桁が使いやすい目安です。</w:t>
-      </w:r>
-    </w:p>
-    <w:p>
-      <w:pPr>
-        <w:numPr>
-          <w:ilvl w:val="0"/>
-          <w:numId w:val="1016"/>
-        </w:numPr>
-        <w:pStyle w:val="Compact"/>
-      </w:pPr>
-      <w:r>
-        <w:t xml:space="preserve">周波数表示の右の</w:t>
-      </w:r>
-      <w:r>
-        <w:t xml:space="preserve"> </w:t>
-      </w:r>
-      <w:r>
-        <w:rPr>
-          <w:bCs/>
-          <w:b/>
-        </w:rPr>
-        <w:t xml:space="preserve">▼／▲ ボタン</w:t>
-      </w:r>
-      <w:r>
-        <w:t xml:space="preserve">でも、選んだステップで 1 ステップずつ下げ／上げできます（</w:t>
-      </w:r>
-      <w:r>
-        <w:rPr>
-          <w:bCs/>
-          <w:b/>
-        </w:rPr>
-        <w:t xml:space="preserve">長押しで連続</w:t>
-      </w:r>
-      <w:r>
-        <w:t xml:space="preserve">）。</w:t>
-      </w:r>
-    </w:p>
-    <w:p>
-      <w:pPr>
-        <w:numPr>
-          <w:ilvl w:val="0"/>
-          <w:numId w:val="1016"/>
         </w:numPr>
         <w:pStyle w:val="Compact"/>
       </w:pPr>
@@ -1987,7 +2081,7 @@
       <w:pPr>
         <w:numPr>
           <w:ilvl w:val="0"/>
-          <w:numId w:val="1018"/>
+          <w:numId w:val="1019"/>
         </w:numPr>
         <w:pStyle w:val="Compact"/>
       </w:pPr>
@@ -2022,7 +2116,7 @@
       <w:pPr>
         <w:numPr>
           <w:ilvl w:val="0"/>
-          <w:numId w:val="1018"/>
+          <w:numId w:val="1019"/>
         </w:numPr>
         <w:pStyle w:val="Compact"/>
       </w:pPr>
@@ -2051,7 +2145,7 @@
       <w:pPr>
         <w:numPr>
           <w:ilvl w:val="0"/>
-          <w:numId w:val="1019"/>
+          <w:numId w:val="1020"/>
         </w:numPr>
         <w:pStyle w:val="Compact"/>
       </w:pPr>
@@ -2083,7 +2177,7 @@
       <w:pPr>
         <w:numPr>
           <w:ilvl w:val="0"/>
-          <w:numId w:val="1019"/>
+          <w:numId w:val="1020"/>
         </w:numPr>
         <w:pStyle w:val="Compact"/>
       </w:pPr>
@@ -2102,7 +2196,7 @@
       <w:pPr>
         <w:numPr>
           <w:ilvl w:val="0"/>
-          <w:numId w:val="1019"/>
+          <w:numId w:val="1020"/>
         </w:numPr>
         <w:pStyle w:val="Compact"/>
       </w:pPr>
@@ -2158,7 +2252,7 @@
       <w:pPr>
         <w:numPr>
           <w:ilvl w:val="0"/>
-          <w:numId w:val="1020"/>
+          <w:numId w:val="1021"/>
         </w:numPr>
         <w:pStyle w:val="Compact"/>
       </w:pPr>
@@ -2177,7 +2271,7 @@
       <w:pPr>
         <w:numPr>
           <w:ilvl w:val="0"/>
-          <w:numId w:val="1020"/>
+          <w:numId w:val="1021"/>
         </w:numPr>
         <w:pStyle w:val="Compact"/>
       </w:pPr>
@@ -2196,7 +2290,7 @@
       <w:pPr>
         <w:numPr>
           <w:ilvl w:val="0"/>
-          <w:numId w:val="1020"/>
+          <w:numId w:val="1021"/>
         </w:numPr>
         <w:pStyle w:val="Compact"/>
       </w:pPr>
@@ -2391,7 +2485,7 @@
       <w:pPr>
         <w:numPr>
           <w:ilvl w:val="0"/>
-          <w:numId w:val="1021"/>
+          <w:numId w:val="1022"/>
         </w:numPr>
         <w:pStyle w:val="Compact"/>
       </w:pPr>
@@ -2470,7 +2564,7 @@
       <w:pPr>
         <w:numPr>
           <w:ilvl w:val="0"/>
-          <w:numId w:val="1022"/>
+          <w:numId w:val="1023"/>
         </w:numPr>
         <w:pStyle w:val="Compact"/>
       </w:pPr>
@@ -2489,7 +2583,7 @@
       <w:pPr>
         <w:numPr>
           <w:ilvl w:val="0"/>
-          <w:numId w:val="1022"/>
+          <w:numId w:val="1023"/>
         </w:numPr>
         <w:pStyle w:val="Compact"/>
       </w:pPr>
@@ -2518,42 +2612,42 @@
       <w:pPr>
         <w:numPr>
           <w:ilvl w:val="1"/>
+          <w:numId w:val="1024"/>
+        </w:numPr>
+        <w:pStyle w:val="Compact"/>
+      </w:pPr>
+      <w:r>
+        <w:t xml:space="preserve">目安:</w:t>
+      </w:r>
+      <w:r>
+        <w:t xml:space="preserve"> </w:t>
+      </w:r>
+      <w:r>
+        <w:rPr>
+          <w:bCs/>
+          <w:b/>
+        </w:rPr>
+        <w:t xml:space="preserve">1.5 以下＝良好</w:t>
+      </w:r>
+      <w:r>
+        <w:t xml:space="preserve">、2 前後＝許容範囲、</w:t>
+      </w:r>
+      <w:r>
+        <w:rPr>
+          <w:bCs/>
+          <w:b/>
+        </w:rPr>
+        <w:t xml:space="preserve">3 以上＝要調整</w:t>
+      </w:r>
+      <w:r>
+        <w:t xml:space="preserve">（ATU でのチューニングやアンテナの点検を）。</w:t>
+      </w:r>
+    </w:p>
+    <w:p>
+      <w:pPr>
+        <w:numPr>
+          <w:ilvl w:val="0"/>
           <w:numId w:val="1023"/>
-        </w:numPr>
-        <w:pStyle w:val="Compact"/>
-      </w:pPr>
-      <w:r>
-        <w:t xml:space="preserve">目安:</w:t>
-      </w:r>
-      <w:r>
-        <w:t xml:space="preserve"> </w:t>
-      </w:r>
-      <w:r>
-        <w:rPr>
-          <w:bCs/>
-          <w:b/>
-        </w:rPr>
-        <w:t xml:space="preserve">1.5 以下＝良好</w:t>
-      </w:r>
-      <w:r>
-        <w:t xml:space="preserve">、2 前後＝許容範囲、</w:t>
-      </w:r>
-      <w:r>
-        <w:rPr>
-          <w:bCs/>
-          <w:b/>
-        </w:rPr>
-        <w:t xml:space="preserve">3 以上＝要調整</w:t>
-      </w:r>
-      <w:r>
-        <w:t xml:space="preserve">（ATU でのチューニングやアンテナの点検を）。</w:t>
-      </w:r>
-    </w:p>
-    <w:p>
-      <w:pPr>
-        <w:numPr>
-          <w:ilvl w:val="0"/>
-          <w:numId w:val="1022"/>
         </w:numPr>
         <w:pStyle w:val="Compact"/>
       </w:pPr>
@@ -3282,7 +3376,7 @@
       <w:pPr>
         <w:numPr>
           <w:ilvl w:val="0"/>
-          <w:numId w:val="1024"/>
+          <w:numId w:val="1025"/>
         </w:numPr>
         <w:pStyle w:val="Compact"/>
       </w:pPr>
@@ -3301,7 +3395,7 @@
       <w:pPr>
         <w:numPr>
           <w:ilvl w:val="0"/>
-          <w:numId w:val="1024"/>
+          <w:numId w:val="1025"/>
         </w:numPr>
         <w:pStyle w:val="Compact"/>
       </w:pPr>
@@ -3851,7 +3945,7 @@
       <w:pPr>
         <w:numPr>
           <w:ilvl w:val="0"/>
-          <w:numId w:val="1025"/>
+          <w:numId w:val="1026"/>
         </w:numPr>
         <w:pStyle w:val="Compact"/>
       </w:pPr>
@@ -3879,7 +3973,7 @@
       <w:pPr>
         <w:numPr>
           <w:ilvl w:val="0"/>
-          <w:numId w:val="1025"/>
+          <w:numId w:val="1026"/>
         </w:numPr>
         <w:pStyle w:val="Compact"/>
       </w:pPr>
@@ -3891,7 +3985,7 @@
       <w:pPr>
         <w:numPr>
           <w:ilvl w:val="0"/>
-          <w:numId w:val="1025"/>
+          <w:numId w:val="1026"/>
         </w:numPr>
         <w:pStyle w:val="Compact"/>
       </w:pPr>
@@ -3913,7 +4007,7 @@
       <w:pPr>
         <w:numPr>
           <w:ilvl w:val="0"/>
-          <w:numId w:val="1025"/>
+          <w:numId w:val="1026"/>
         </w:numPr>
         <w:pStyle w:val="Compact"/>
       </w:pPr>
@@ -3935,7 +4029,7 @@
       <w:pPr>
         <w:numPr>
           <w:ilvl w:val="0"/>
-          <w:numId w:val="1025"/>
+          <w:numId w:val="1026"/>
         </w:numPr>
         <w:pStyle w:val="Compact"/>
       </w:pPr>
@@ -3999,7 +4093,7 @@
       <w:pPr>
         <w:numPr>
           <w:ilvl w:val="0"/>
-          <w:numId w:val="1026"/>
+          <w:numId w:val="1027"/>
         </w:numPr>
         <w:pStyle w:val="Compact"/>
       </w:pPr>
@@ -4021,7 +4115,7 @@
       <w:pPr>
         <w:numPr>
           <w:ilvl w:val="0"/>
-          <w:numId w:val="1026"/>
+          <w:numId w:val="1027"/>
         </w:numPr>
         <w:pStyle w:val="Compact"/>
       </w:pPr>
@@ -4069,7 +4163,7 @@
       <w:pPr>
         <w:numPr>
           <w:ilvl w:val="0"/>
-          <w:numId w:val="1026"/>
+          <w:numId w:val="1027"/>
         </w:numPr>
         <w:pStyle w:val="Compact"/>
       </w:pPr>
@@ -4091,7 +4185,7 @@
       <w:pPr>
         <w:numPr>
           <w:ilvl w:val="0"/>
-          <w:numId w:val="1026"/>
+          <w:numId w:val="1027"/>
         </w:numPr>
         <w:pStyle w:val="Compact"/>
       </w:pPr>
@@ -4119,7 +4213,7 @@
       <w:pPr>
         <w:numPr>
           <w:ilvl w:val="0"/>
-          <w:numId w:val="1026"/>
+          <w:numId w:val="1027"/>
         </w:numPr>
         <w:pStyle w:val="Compact"/>
       </w:pPr>
@@ -4162,7 +4256,7 @@
       <w:pPr>
         <w:numPr>
           <w:ilvl w:val="0"/>
-          <w:numId w:val="1027"/>
+          <w:numId w:val="1028"/>
         </w:numPr>
         <w:pStyle w:val="Compact"/>
       </w:pPr>
@@ -4174,7 +4268,7 @@
       <w:pPr>
         <w:numPr>
           <w:ilvl w:val="0"/>
-          <w:numId w:val="1027"/>
+          <w:numId w:val="1028"/>
         </w:numPr>
         <w:pStyle w:val="Compact"/>
       </w:pPr>
@@ -4208,7 +4302,7 @@
       <w:pPr>
         <w:numPr>
           <w:ilvl w:val="0"/>
-          <w:numId w:val="1027"/>
+          <w:numId w:val="1028"/>
         </w:numPr>
         <w:pStyle w:val="Compact"/>
       </w:pPr>
@@ -4240,7 +4334,7 @@
       <w:pPr>
         <w:numPr>
           <w:ilvl w:val="0"/>
-          <w:numId w:val="1027"/>
+          <w:numId w:val="1028"/>
         </w:numPr>
         <w:pStyle w:val="Compact"/>
       </w:pPr>
@@ -4278,7 +4372,7 @@
       <w:pPr>
         <w:numPr>
           <w:ilvl w:val="0"/>
-          <w:numId w:val="1027"/>
+          <w:numId w:val="1028"/>
         </w:numPr>
         <w:pStyle w:val="Compact"/>
       </w:pPr>
@@ -4300,7 +4394,7 @@
       <w:pPr>
         <w:numPr>
           <w:ilvl w:val="0"/>
-          <w:numId w:val="1027"/>
+          <w:numId w:val="1028"/>
         </w:numPr>
         <w:pStyle w:val="Compact"/>
       </w:pPr>
@@ -4419,7 +4513,7 @@
       <w:pPr>
         <w:numPr>
           <w:ilvl w:val="0"/>
-          <w:numId w:val="1028"/>
+          <w:numId w:val="1029"/>
         </w:numPr>
         <w:pStyle w:val="Compact"/>
       </w:pPr>
@@ -4448,7 +4542,7 @@
       <w:pPr>
         <w:numPr>
           <w:ilvl w:val="0"/>
-          <w:numId w:val="1028"/>
+          <w:numId w:val="1029"/>
         </w:numPr>
         <w:pStyle w:val="Compact"/>
       </w:pPr>
@@ -4467,7 +4561,7 @@
       <w:pPr>
         <w:numPr>
           <w:ilvl w:val="0"/>
-          <w:numId w:val="1028"/>
+          <w:numId w:val="1029"/>
         </w:numPr>
         <w:pStyle w:val="Compact"/>
       </w:pPr>
@@ -4486,7 +4580,7 @@
       <w:pPr>
         <w:numPr>
           <w:ilvl w:val="0"/>
-          <w:numId w:val="1028"/>
+          <w:numId w:val="1029"/>
         </w:numPr>
         <w:pStyle w:val="Compact"/>
       </w:pPr>
@@ -4521,7 +4615,7 @@
       <w:pPr>
         <w:numPr>
           <w:ilvl w:val="0"/>
-          <w:numId w:val="1028"/>
+          <w:numId w:val="1029"/>
         </w:numPr>
         <w:pStyle w:val="Compact"/>
       </w:pPr>
@@ -4540,7 +4634,7 @@
       <w:pPr>
         <w:numPr>
           <w:ilvl w:val="0"/>
-          <w:numId w:val="1028"/>
+          <w:numId w:val="1029"/>
         </w:numPr>
         <w:pStyle w:val="Compact"/>
       </w:pPr>
@@ -4559,7 +4653,7 @@
       <w:pPr>
         <w:numPr>
           <w:ilvl w:val="0"/>
-          <w:numId w:val="1028"/>
+          <w:numId w:val="1029"/>
         </w:numPr>
         <w:pStyle w:val="Compact"/>
       </w:pPr>
@@ -4578,7 +4672,7 @@
       <w:pPr>
         <w:numPr>
           <w:ilvl w:val="0"/>
-          <w:numId w:val="1028"/>
+          <w:numId w:val="1029"/>
         </w:numPr>
         <w:pStyle w:val="Compact"/>
       </w:pPr>
@@ -4644,7 +4738,7 @@
       <w:pPr>
         <w:numPr>
           <w:ilvl w:val="0"/>
-          <w:numId w:val="1029"/>
+          <w:numId w:val="1030"/>
         </w:numPr>
         <w:pStyle w:val="Compact"/>
       </w:pPr>
@@ -4669,7 +4763,7 @@
       <w:pPr>
         <w:numPr>
           <w:ilvl w:val="0"/>
-          <w:numId w:val="1029"/>
+          <w:numId w:val="1030"/>
         </w:numPr>
         <w:pStyle w:val="Compact"/>
       </w:pPr>
@@ -4703,7 +4797,7 @@
       <w:pPr>
         <w:numPr>
           <w:ilvl w:val="0"/>
-          <w:numId w:val="1029"/>
+          <w:numId w:val="1030"/>
         </w:numPr>
         <w:pStyle w:val="Compact"/>
       </w:pPr>
@@ -4735,7 +4829,7 @@
       <w:pPr>
         <w:numPr>
           <w:ilvl w:val="0"/>
-          <w:numId w:val="1029"/>
+          <w:numId w:val="1030"/>
         </w:numPr>
         <w:pStyle w:val="Compact"/>
       </w:pPr>
@@ -5035,7 +5129,7 @@
       <w:pPr>
         <w:numPr>
           <w:ilvl w:val="0"/>
-          <w:numId w:val="1030"/>
+          <w:numId w:val="1031"/>
         </w:numPr>
         <w:pStyle w:val="Compact"/>
       </w:pPr>
@@ -5119,7 +5213,7 @@
       <w:pPr>
         <w:numPr>
           <w:ilvl w:val="0"/>
-          <w:numId w:val="1031"/>
+          <w:numId w:val="1032"/>
         </w:numPr>
         <w:pStyle w:val="Compact"/>
       </w:pPr>
@@ -5138,7 +5232,7 @@
       <w:pPr>
         <w:numPr>
           <w:ilvl w:val="0"/>
-          <w:numId w:val="1031"/>
+          <w:numId w:val="1032"/>
         </w:numPr>
         <w:pStyle w:val="Compact"/>
       </w:pPr>
@@ -5157,7 +5251,7 @@
       <w:pPr>
         <w:numPr>
           <w:ilvl w:val="0"/>
-          <w:numId w:val="1031"/>
+          <w:numId w:val="1032"/>
         </w:numPr>
         <w:pStyle w:val="Compact"/>
       </w:pPr>
@@ -5176,7 +5270,7 @@
       <w:pPr>
         <w:numPr>
           <w:ilvl w:val="0"/>
-          <w:numId w:val="1031"/>
+          <w:numId w:val="1032"/>
         </w:numPr>
         <w:pStyle w:val="Compact"/>
       </w:pPr>
@@ -5222,7 +5316,7 @@
       <w:pPr>
         <w:numPr>
           <w:ilvl w:val="0"/>
-          <w:numId w:val="1032"/>
+          <w:numId w:val="1033"/>
         </w:numPr>
         <w:pStyle w:val="Compact"/>
       </w:pPr>
@@ -5241,7 +5335,7 @@
       <w:pPr>
         <w:numPr>
           <w:ilvl w:val="0"/>
-          <w:numId w:val="1032"/>
+          <w:numId w:val="1033"/>
         </w:numPr>
         <w:pStyle w:val="Compact"/>
       </w:pPr>
@@ -5570,7 +5664,7 @@
       <w:pPr>
         <w:numPr>
           <w:ilvl w:val="0"/>
-          <w:numId w:val="1033"/>
+          <w:numId w:val="1034"/>
         </w:numPr>
         <w:pStyle w:val="Compact"/>
       </w:pPr>
@@ -5592,7 +5686,7 @@
       <w:pPr>
         <w:numPr>
           <w:ilvl w:val="0"/>
-          <w:numId w:val="1033"/>
+          <w:numId w:val="1034"/>
         </w:numPr>
         <w:pStyle w:val="Compact"/>
       </w:pPr>
@@ -5614,7 +5708,7 @@
       <w:pPr>
         <w:numPr>
           <w:ilvl w:val="0"/>
-          <w:numId w:val="1033"/>
+          <w:numId w:val="1034"/>
         </w:numPr>
         <w:pStyle w:val="Compact"/>
       </w:pPr>
@@ -5639,7 +5733,7 @@
       <w:pPr>
         <w:numPr>
           <w:ilvl w:val="0"/>
-          <w:numId w:val="1033"/>
+          <w:numId w:val="1034"/>
         </w:numPr>
         <w:pStyle w:val="Compact"/>
       </w:pPr>
@@ -5684,7 +5778,7 @@
       <w:pPr>
         <w:numPr>
           <w:ilvl w:val="0"/>
-          <w:numId w:val="1033"/>
+          <w:numId w:val="1034"/>
         </w:numPr>
         <w:pStyle w:val="Compact"/>
       </w:pPr>
@@ -5732,7 +5826,7 @@
       <w:pPr>
         <w:numPr>
           <w:ilvl w:val="0"/>
-          <w:numId w:val="1033"/>
+          <w:numId w:val="1034"/>
         </w:numPr>
         <w:pStyle w:val="Compact"/>
       </w:pPr>
@@ -5760,7 +5854,7 @@
       <w:pPr>
         <w:numPr>
           <w:ilvl w:val="0"/>
-          <w:numId w:val="1033"/>
+          <w:numId w:val="1034"/>
         </w:numPr>
         <w:pStyle w:val="Compact"/>
       </w:pPr>
@@ -5808,7 +5902,7 @@
       <w:pPr>
         <w:numPr>
           <w:ilvl w:val="0"/>
-          <w:numId w:val="1033"/>
+          <w:numId w:val="1034"/>
         </w:numPr>
         <w:pStyle w:val="Compact"/>
       </w:pPr>
@@ -6256,7 +6350,7 @@
       <w:pPr>
         <w:numPr>
           <w:ilvl w:val="0"/>
-          <w:numId w:val="1034"/>
+          <w:numId w:val="1035"/>
         </w:numPr>
       </w:pPr>
       <w:r>
@@ -6277,7 +6371,7 @@
       <w:pPr>
         <w:numPr>
           <w:ilvl w:val="0"/>
-          <w:numId w:val="1034"/>
+          <w:numId w:val="1035"/>
         </w:numPr>
       </w:pPr>
       <w:r>
@@ -6295,7 +6389,7 @@
       <w:pPr>
         <w:numPr>
           <w:ilvl w:val="0"/>
-          <w:numId w:val="1034"/>
+          <w:numId w:val="1035"/>
         </w:numPr>
       </w:pPr>
       <w:r>
@@ -6322,7 +6416,7 @@
       <w:pPr>
         <w:numPr>
           <w:ilvl w:val="0"/>
-          <w:numId w:val="1034"/>
+          <w:numId w:val="1035"/>
         </w:numPr>
       </w:pPr>
       <w:r>
@@ -6333,7 +6427,7 @@
       <w:pPr>
         <w:numPr>
           <w:ilvl w:val="0"/>
-          <w:numId w:val="1034"/>
+          <w:numId w:val="1035"/>
         </w:numPr>
       </w:pPr>
       <w:r>
@@ -6344,7 +6438,7 @@
       <w:pPr>
         <w:numPr>
           <w:ilvl w:val="0"/>
-          <w:numId w:val="1034"/>
+          <w:numId w:val="1035"/>
         </w:numPr>
       </w:pPr>
       <w:r>
@@ -6355,7 +6449,7 @@
       <w:pPr>
         <w:numPr>
           <w:ilvl w:val="0"/>
-          <w:numId w:val="1034"/>
+          <w:numId w:val="1035"/>
         </w:numPr>
       </w:pPr>
       <w:r>
@@ -6376,7 +6470,7 @@
       <w:pPr>
         <w:numPr>
           <w:ilvl w:val="0"/>
-          <w:numId w:val="1034"/>
+          <w:numId w:val="1035"/>
         </w:numPr>
       </w:pPr>
       <w:r>
@@ -6728,9 +6822,6 @@
     <w:abstractNumId w:val="991"/>
   </w:num>
   <w:num w:numId="1010">
-    <w:abstractNumId w:val="991"/>
-  </w:num>
-  <w:num w:numId="1011">
     <w:abstractNumId w:val="99411"/>
     <w:lvlOverride w:ilvl="0">
       <w:startOverride w:val="1"/>
@@ -6760,19 +6851,10 @@
       <w:startOverride w:val="1"/>
     </w:lvlOverride>
   </w:num>
-  <w:num w:numId="1012">
+  <w:num w:numId="1011">
     <w:abstractNumId w:val="991"/>
   </w:num>
-  <w:num w:numId="1013">
-    <w:abstractNumId w:val="991"/>
-  </w:num>
-  <w:num w:numId="1014">
-    <w:abstractNumId w:val="991"/>
-  </w:num>
-  <w:num w:numId="1015">
-    <w:abstractNumId w:val="991"/>
-  </w:num>
-  <w:num w:numId="1016">
+  <w:num w:numId="1012">
     <w:abstractNumId w:val="99411"/>
     <w:lvlOverride w:ilvl="0">
       <w:startOverride w:val="1"/>
@@ -6802,34 +6884,19 @@
       <w:startOverride w:val="1"/>
     </w:lvlOverride>
   </w:num>
-  <w:num w:numId="1017">
+  <w:num w:numId="1013">
     <w:abstractNumId w:val="991"/>
   </w:num>
-  <w:num w:numId="1018">
+  <w:num w:numId="1014">
     <w:abstractNumId w:val="991"/>
   </w:num>
-  <w:num w:numId="1019">
+  <w:num w:numId="1015">
     <w:abstractNumId w:val="991"/>
   </w:num>
-  <w:num w:numId="1020">
+  <w:num w:numId="1016">
     <w:abstractNumId w:val="991"/>
   </w:num>
-  <w:num w:numId="1021">
-    <w:abstractNumId w:val="991"/>
-  </w:num>
-  <w:num w:numId="1022">
-    <w:abstractNumId w:val="991"/>
-  </w:num>
-  <w:num w:numId="1023">
-    <w:abstractNumId w:val="991"/>
-  </w:num>
-  <w:num w:numId="1024">
-    <w:abstractNumId w:val="991"/>
-  </w:num>
-  <w:num w:numId="1025">
-    <w:abstractNumId w:val="991"/>
-  </w:num>
-  <w:num w:numId="1026">
+  <w:num w:numId="1017">
     <w:abstractNumId w:val="99411"/>
     <w:lvlOverride w:ilvl="0">
       <w:startOverride w:val="1"/>
@@ -6858,6 +6925,33 @@
     <w:lvlOverride w:ilvl="8">
       <w:startOverride w:val="1"/>
     </w:lvlOverride>
+  </w:num>
+  <w:num w:numId="1018">
+    <w:abstractNumId w:val="991"/>
+  </w:num>
+  <w:num w:numId="1019">
+    <w:abstractNumId w:val="991"/>
+  </w:num>
+  <w:num w:numId="1020">
+    <w:abstractNumId w:val="991"/>
+  </w:num>
+  <w:num w:numId="1021">
+    <w:abstractNumId w:val="991"/>
+  </w:num>
+  <w:num w:numId="1022">
+    <w:abstractNumId w:val="991"/>
+  </w:num>
+  <w:num w:numId="1023">
+    <w:abstractNumId w:val="991"/>
+  </w:num>
+  <w:num w:numId="1024">
+    <w:abstractNumId w:val="991"/>
+  </w:num>
+  <w:num w:numId="1025">
+    <w:abstractNumId w:val="991"/>
+  </w:num>
+  <w:num w:numId="1026">
+    <w:abstractNumId w:val="991"/>
   </w:num>
   <w:num w:numId="1027">
     <w:abstractNumId w:val="99411"/>
@@ -6890,9 +6984,6 @@
     </w:lvlOverride>
   </w:num>
   <w:num w:numId="1028">
-    <w:abstractNumId w:val="991"/>
-  </w:num>
-  <w:num w:numId="1029">
     <w:abstractNumId w:val="99411"/>
     <w:lvlOverride w:ilvl="0">
       <w:startOverride w:val="1"/>
@@ -6922,16 +7013,10 @@
       <w:startOverride w:val="1"/>
     </w:lvlOverride>
   </w:num>
-  <w:num w:numId="1030">
+  <w:num w:numId="1029">
     <w:abstractNumId w:val="991"/>
   </w:num>
-  <w:num w:numId="1031">
-    <w:abstractNumId w:val="991"/>
-  </w:num>
-  <w:num w:numId="1032">
-    <w:abstractNumId w:val="991"/>
-  </w:num>
-  <w:num w:numId="1033">
+  <w:num w:numId="1030">
     <w:abstractNumId w:val="99411"/>
     <w:lvlOverride w:ilvl="0">
       <w:startOverride w:val="1"/>
@@ -6961,7 +7046,46 @@
       <w:startOverride w:val="1"/>
     </w:lvlOverride>
   </w:num>
+  <w:num w:numId="1031">
+    <w:abstractNumId w:val="991"/>
+  </w:num>
+  <w:num w:numId="1032">
+    <w:abstractNumId w:val="991"/>
+  </w:num>
+  <w:num w:numId="1033">
+    <w:abstractNumId w:val="991"/>
+  </w:num>
   <w:num w:numId="1034">
+    <w:abstractNumId w:val="99411"/>
+    <w:lvlOverride w:ilvl="0">
+      <w:startOverride w:val="1"/>
+    </w:lvlOverride>
+    <w:lvlOverride w:ilvl="1">
+      <w:startOverride w:val="1"/>
+    </w:lvlOverride>
+    <w:lvlOverride w:ilvl="2">
+      <w:startOverride w:val="1"/>
+    </w:lvlOverride>
+    <w:lvlOverride w:ilvl="3">
+      <w:startOverride w:val="1"/>
+    </w:lvlOverride>
+    <w:lvlOverride w:ilvl="4">
+      <w:startOverride w:val="1"/>
+    </w:lvlOverride>
+    <w:lvlOverride w:ilvl="5">
+      <w:startOverride w:val="1"/>
+    </w:lvlOverride>
+    <w:lvlOverride w:ilvl="6">
+      <w:startOverride w:val="1"/>
+    </w:lvlOverride>
+    <w:lvlOverride w:ilvl="7">
+      <w:startOverride w:val="1"/>
+    </w:lvlOverride>
+    <w:lvlOverride w:ilvl="8">
+      <w:startOverride w:val="1"/>
+    </w:lvlOverride>
+  </w:num>
+  <w:num w:numId="1035">
     <w:abstractNumId w:val="991"/>
   </w:num>
 </w:numbering>

</xml_diff>

<commit_message>
Add white border to app icon, raise RX/TX latency max to 1000ms
Outline the launcher icon (legacy PNGs + adaptive icon background) with
a thick white ring for better contrast against wallpapers. Extend the
RX/TX Latency sliders' max from 500ms to 1000ms to allow more headroom
on unstable connections, and clarify the Tx(dBfs) meter description.
Sync README/help_ja.md/help_ja.docx with the above.

Co-Authored-By: Claude Sonnet 5 <noreply@anthropic.com>
</commit_message>
<xml_diff>
--- a/docs/help_ja.docx
+++ b/docs/help_ja.docx
@@ -1181,6 +1181,25 @@
       </w:r>
       <w:r>
         <w:t xml:space="preserve">: 受信・送信音声のコーデックとサンプルレート。通常は既定のままで動作します。音が途切れる回線では低いレートやより圧縮率の高いコーデック（Opus など）を試してください。</w:t>
+      </w:r>
+    </w:p>
+    <w:p>
+      <w:pPr>
+        <w:numPr>
+          <w:ilvl w:val="1"/>
+          <w:numId w:val="1013"/>
+        </w:numPr>
+        <w:pStyle w:val="Compact"/>
+      </w:pPr>
+      <w:r>
+        <w:rPr>
+          <w:bCs/>
+          <w:b/>
+        </w:rPr>
+        <w:t>RX Latency / TX Latency</w:t>
+      </w:r>
+      <w:r>
+        <w:t>: 受信・送信それぞれの音声バッファ量（30〜1000ms）。回線が不安定で音声が途切れる場合は値を大きくすると改善しますが、その分だけ音声の遅延が増えます。安定した回線では小さい値のままで問題ありません。</w:t>
       </w:r>
     </w:p>
     <w:p>
@@ -2679,7 +2698,7 @@
         <w:t xml:space="preserve">Tx(dBfs) メーター</w:t>
       </w:r>
       <w:r>
-        <w:t xml:space="preserve">: 送信中の自分の変調（マイク）レベルです。目安は -12〜-6 dBfs（→ 7章、17章）。</w:t>
+        <w:t>: 送信時に使われるマイクの入力レベルです。受信時にもレベルは変化します。目安は -12〜-6 dBfs（→ 7章、17章）。</w:t>
       </w:r>
     </w:p>
     <w:p>

</xml_diff>